<commit_message>
test2: put the sector toggle ahead of the Budget section
The split is a per-sector input, so placing it in a sector-agnostic Budget
section meant showing two controls at once, one for water and one for
sanitation. That is noise, and it invites setting the wrong one.

The Water Supply / Sanitation toggle now sits between sections 4 and 5, so
everything from the budget onward is entered one sector at a time and the split
control below follows whatever is selected. One control, not a pair. The toggle
markup is defined once and rendered in two places, above the Budget section on
Data Inputs and above section 6 on the BAU tab, rather than duplicated.

Guide and figure updated to match, and the Word build regenerated.
</commit_message>
<xml_diff>
--- a/HOW_TO_USE.docx
+++ b/HOW_TO_USE.docx
@@ -1085,7 +1085,17 @@
         <w:jc w:val="left"/>
       </w:pPr>
       <w:r>
-        <w:t xml:space="preserve">The first tab collects everything the model needs before it can project anything. Work down the five numbered sections in order. Sections 1 and 2 apply to the whole analysis and are shared across areas. Sections 3 onward are specific to the area named in the </w:t>
+        <w:t xml:space="preserve">The first tab collects everything the model needs before it can project anything. Work down the five numbered sections in order. Sections 1 and 2 apply to the whole analysis and are shared across areas. The </w:t>
+      </w:r>
+      <w:r>
+        <w:rPr>
+          <w:b/>
+          <w:bCs/>
+        </w:rPr>
+        <w:t xml:space="preserve">Water Supply / Sanitation</w:t>
+      </w:r>
+      <w:r>
+        <w:t xml:space="preserve"> toggle sits between sections 4 and 5, because everything from the budget onward is entered one sector at a time. Sections 3 onward are specific to the area named in the </w:t>
       </w:r>
       <w:r>
         <w:rPr>
@@ -2418,7 +2428,26 @@
         <w:jc w:val="left"/>
       </w:pPr>
       <w:r>
-        <w:t xml:space="preserve">Two further controls sit beneath the budget table, one for water supply and one for sanitation. They are inputs rather than interventions, and they belong here because they drive the business-as-usual projection, not only the designed scenario.</w:t>
+        <w:t xml:space="preserve">A further control sits beneath the budget table. It is an input rather than an intervention, and it belongs here because it drives the business-as-usual projection, not only the designed scenario.</w:t>
+      </w:r>
+    </w:p>
+    <w:p>
+      <w:pPr>
+        <w:spacing w:after="140" w:line="276"/>
+        <w:jc w:val="left"/>
+      </w:pPr>
+      <w:r>
+        <w:t xml:space="preserve">The split is set per sector. The </w:t>
+      </w:r>
+      <w:r>
+        <w:rPr>
+          <w:b/>
+          <w:bCs/>
+        </w:rPr>
+        <w:t xml:space="preserve">Water Supply / Sanitation</w:t>
+      </w:r>
+      <w:r>
+        <w:t xml:space="preserve"> toggle directly above the budget section chooses which sector the control is editing, so switch sectors and set it twice.</w:t>
       </w:r>
     </w:p>
     <w:p>
@@ -2532,7 +2561,7 @@
       <w:r>
         <w:drawing>
           <wp:inline distT="0" distB="0" distL="0" distR="0">
-            <wp:extent cx="5943600" cy="3086100"/>
+            <wp:extent cx="5943600" cy="3133725"/>
             <wp:effectExtent t="0" r="0" b="0" l="0"/>
             <wp:docPr id="1" name="" descr="" title=""/>
             <wp:cNvGraphicFramePr>
@@ -2557,7 +2586,7 @@
                   <pic:spPr bwMode="auto">
                     <a:xfrm>
                       <a:off x="0" y="0"/>
-                      <a:ext cx="5943600" cy="3086100"/>
+                      <a:ext cx="5943600" cy="3133725"/>
                     </a:xfrm>
                     <a:prstGeom prst="rect">
                       <a:avLst/>
@@ -2593,7 +2622,7 @@
           <w:sz w:val="19"/>
           <w:szCs w:val="19"/>
         </w:rPr>
-        <w:t xml:space="preserve"> One control per sector. Each pair of percentage fields always totals 100, and the slider moves both at once. The default of 100 percent safely managed reproduces a model that only ever buys the top service level.</w:t>
+        <w:t xml:space="preserve"> The sector toggle sits above the budget section, so the control below it follows whichever sector is selected. The pair of percentage fields always totals 100, and the slider moves both at once. The default of 100 percent safely managed reproduces a model that only ever buys the top service level.</w:t>
       </w:r>
     </w:p>
     <w:p>

</xml_diff>

<commit_message>
test2: make the sector toggle sit in the section stack
On the Data Inputs tab the panel is 1200px wide, so two flex-1 buttons stretched
into full-width slabs that matched nothing around them and read as a banner
rather than a control.

It is now a compact segmented control in a card, the same width and corner
radius as the section headers it sits between, with a "Sector" label and a note
that the sections below are entered one sector at a time. Sized to its content,
so it looks right in the wide Data-Inputs column and wraps cleanly in the
narrower BAU panel, where the same element is reused.

Budget figure recaptured and the Word build regenerated.
</commit_message>
<xml_diff>
--- a/HOW_TO_USE.docx
+++ b/HOW_TO_USE.docx
@@ -2561,7 +2561,7 @@
       <w:r>
         <w:drawing>
           <wp:inline distT="0" distB="0" distL="0" distR="0">
-            <wp:extent cx="5943600" cy="3133725"/>
+            <wp:extent cx="5943600" cy="3171825"/>
             <wp:effectExtent t="0" r="0" b="0" l="0"/>
             <wp:docPr id="1" name="" descr="" title=""/>
             <wp:cNvGraphicFramePr>
@@ -2586,7 +2586,7 @@
                   <pic:spPr bwMode="auto">
                     <a:xfrm>
                       <a:off x="0" y="0"/>
-                      <a:ext cx="5943600" cy="3133725"/>
+                      <a:ext cx="5943600" cy="3171825"/>
                     </a:xfrm>
                     <a:prstGeom prst="rect">
                       <a:avLst/>

</xml_diff>

<commit_message>
test2: warn when technology-mix shares do not total 100%
A mix summing to less than 100% understates the weighted unit cost, which
overstates how many households the budget reaches. Nothing stopped it. The only
signal was a small line under the table, easy to miss and easy to read as
informational.

Shares that do not total 100% now turn the share cells of that table red and
raise a named warning alongside the existing validation, so it surfaces the way
a bad target column already does. All six mixes are covered: the safely-managed
and basic mixes for each sector, plus the optimised-technology lever's own two,
checked only where that lever is switched on.

The guide now describes the check rather than telling the reader to watch for
the trap themselves, and the Guide-panel description says cards recommend data
sources under "How to find it", with links under "Sources".
</commit_message>
<xml_diff>
--- a/HOW_TO_USE.docx
+++ b/HOW_TO_USE.docx
@@ -898,7 +898,7 @@
         <w:jc w:val="left"/>
       </w:pPr>
       <w:r>
-        <w:t xml:space="preserve">The panel holds one collapsible card per form section. Click a card to expand it. Most cards carry a </w:t>
+        <w:t xml:space="preserve">The panel holds one collapsible card per form section. Click a card to expand it. Most cards recommend data sources under </w:t>
       </w:r>
       <w:r>
         <w:rPr>
@@ -908,17 +908,17 @@
         <w:t xml:space="preserve">How to find it</w:t>
       </w:r>
       <w:r>
-        <w:t xml:space="preserve"> list naming the datasets a user should go to, and a </w:t>
-      </w:r>
-      <w:r>
-        <w:rPr>
-          <w:b/>
-          <w:bCs/>
-        </w:rPr>
-        <w:t xml:space="preserve">Sources:</w:t>
-      </w:r>
-      <w:r>
-        <w:t xml:space="preserve"> line with links.</w:t>
+        <w:t xml:space="preserve">, with links under </w:t>
+      </w:r>
+      <w:r>
+        <w:rPr>
+          <w:b/>
+          <w:bCs/>
+        </w:rPr>
+        <w:t xml:space="preserve">Sources</w:t>
+      </w:r>
+      <w:r>
+        <w:t xml:space="preserve">.</w:t>
       </w:r>
     </w:p>
     <w:p>
@@ -2716,6 +2716,15 @@
         <w:jc w:val="left"/>
       </w:pPr>
       <w:r>
+        <w:t xml:space="preserve">The tool checks the shares for you. A table that does not total 100 percent turns its share cells red and raises a warning naming the table, because a mix summing to less than 100 percent understates the unit cost and so overstates how many households the budget reaches. Fix the shares before reading any result.</w:t>
+      </w:r>
+    </w:p>
+    <w:p>
+      <w:pPr>
+        <w:spacing w:after="140" w:line="276"/>
+        <w:jc w:val="left"/>
+      </w:pPr>
+      <w:r>
         <w:t xml:space="preserve">The two sectors behave differently, and the difference confuses new users:</w:t>
       </w:r>
     </w:p>

</xml_diff>